<commit_message>
Remove personal-only workspace issues
</commit_message>
<xml_diff>
--- a/docs-assets/OpenClaw_Redeployment_Runbook_WSL_Codex_v8.docx
+++ b/docs-assets/OpenClaw_Redeployment_Runbook_WSL_Codex_v8.docx
@@ -174,14 +174,14 @@
                 <w:b/>
                 <w:sz w:val="20"/>
               </w:rPr>
-              <w:t xml:space="preserve">Naming decision: </w:t>
+              <w:t xml:space="preserve">Workspace path: </w:t>
             </w:r>
             <w:r>
               <w:rPr>
                 <w:rFonts w:ascii="Aptos" w:hAnsi="Aptos"/>
                 <w:sz w:val="20"/>
               </w:rPr>
-              <w:t>Use the generic Linux workspace root ~/projects. Keep the specificity in the project folder name openclaw-isolated-deployment.</w:t>
+              <w:t>Use ~/projects/openclaw-isolated-deployment as the operator workspace path for this repository.</w:t>
             </w:r>
           </w:p>
         </w:tc>
@@ -200,7 +200,7 @@
           <w:color w:val="163A5C"/>
           <w:sz w:val="28"/>
         </w:rPr>
-        <w:t>2. Known Early Trap: Wrong Shell</w:t>
+        <w:t>2. Start the Ubuntu Shell</w:t>
       </w:r>
     </w:p>
     <w:p>
@@ -212,7 +212,7 @@
           <w:rFonts w:ascii="Aptos" w:hAnsi="Aptos"/>
           <w:sz w:val="21"/>
         </w:rPr>
-        <w:t>If the prompt looks like docker-desktop:~#, you are in Docker Desktop's internal WSL environment, not in the Ubuntu distribution intended for this workflow. That shell should not be used for Codex CLI setup or operator-side documentation work.</w:t>
+        <w:t>Launch the Ubuntu distribution intended for this workflow and perform the operator setup from that shell.</w:t>
       </w:r>
     </w:p>
     <w:p>
@@ -283,7 +283,7 @@
                 <w:rFonts w:ascii="Aptos" w:hAnsi="Aptos"/>
                 <w:sz w:val="20"/>
               </w:rPr>
-              <w:t>You should see Ubuntu after installation. docker-desktop may also appear, but it is not the operator shell for this runbook.</w:t>
+              <w:t>You should see Ubuntu after installation.</w:t>
             </w:r>
           </w:p>
         </w:tc>
@@ -503,7 +503,7 @@
                 <w:rFonts w:ascii="Aptos" w:hAnsi="Aptos"/>
                 <w:sz w:val="20"/>
               </w:rPr>
-              <w:t>The output of pwd should point to /home/&lt;your-user&gt;. It should not be /mnt/c/WINDOWS/system32 and the prompt should not be docker-desktop:~#.</w:t>
+              <w:t>The output of pwd should point to /home/&lt;your-user&gt; and the shell should be the Ubuntu user environment for this workflow.</w:t>
             </w:r>
           </w:p>
         </w:tc>
@@ -1000,7 +1000,7 @@
           <w:rFonts w:ascii="Aptos" w:hAnsi="Aptos"/>
           <w:sz w:val="21"/>
         </w:rPr>
-        <w:t>The workspace root and the repository folder are not the same thing. The workspace root stays generic as ~/projects. The repository folder remains specific as openclaw-isolated-deployment.</w:t>
+        <w:t>Use ~/projects/openclaw-isolated-deployment as the repository working path.</w:t>
       </w:r>
     </w:p>
     <w:p>
@@ -1218,7 +1218,7 @@
                 <w:rFonts w:ascii="Aptos" w:hAnsi="Aptos"/>
                 <w:sz w:val="20"/>
               </w:rPr>
-              <w:t>The working project path must resolve to ~/projects/openclaw-isolated-deployment. The repo lives inside the workspace root, not in place of it.</w:t>
+              <w:t>The working project path must resolve to ~/projects/openclaw-isolated-deployment.</w:t>
             </w:r>
           </w:p>
         </w:tc>
@@ -1537,7 +1537,7 @@
                 <w:rFonts w:ascii="Aptos" w:hAnsi="Aptos"/>
                 <w:sz w:val="20"/>
               </w:rPr>
-              <w:t>codex --help should run successfully and pwd should resolve inside ~/projects/openclaw-isolated-deployment.</w:t>
+              <w:t>codex --help should run successfully and pwd should resolve to ~/projects/openclaw-isolated-deployment.</w:t>
             </w:r>
           </w:p>
         </w:tc>
@@ -1582,7 +1582,7 @@
           <w:rFonts w:ascii="Aptos" w:hAnsi="Aptos"/>
           <w:sz w:val="21"/>
         </w:rPr>
-        <w:t>The shell prompt is from Ubuntu, not docker-desktop.</w:t>
+        <w:t>The shell prompt is from Ubuntu.</w:t>
       </w:r>
     </w:p>
     <w:p>

</xml_diff>